<commit_message>
Add Excel integration utilities and tests
- Introduced Excel utilities: `excel_book_finder`, `CagrReader`, and global workbook constants.
- Added corresponding unit and integration tests for the implemented functionalities.
- Updated `pyproject.toml` to include `xlwings` as a dependency.
</commit_message>
<xml_diff>
--- a/resources/docs/Current Excel Workflow.docx
+++ b/resources/docs/Current Excel Workflow.docx
@@ -151,6 +151,1463 @@
         </w:drawing>
       </w:r>
     </w:p>
+    <w:p>
+      <w:pPr>
+        <w:pStyle w:val="SargeHeader"/>
+      </w:pPr>
+      <w:r>
+        <w:t>snapshot</w:t>
+      </w:r>
+    </w:p>
+    <w:p>
+      <w:r>
+        <w:t xml:space="preserve">This is actually the more actively used tool throughout the day. It has views designed for each position type (Equity, Long Puts, Short </w:t>
+      </w:r>
+      <w:proofErr w:type="spellStart"/>
+      <w:r>
+        <w:t>puts</w:t>
+      </w:r>
+      <w:proofErr w:type="spellEnd"/>
+      <w:r>
+        <w:t>, long calls, and short calls. Switching views is controlled by a ribbon</w:t>
+      </w:r>
+    </w:p>
+    <w:p>
+      <w:r>
+        <w:rPr>
+          <w:noProof/>
+          <w14:ligatures w14:val="standardContextual"/>
+        </w:rPr>
+        <w:drawing>
+          <wp:inline distT="0" distB="0" distL="0" distR="0" wp14:anchorId="7850BB5E" wp14:editId="172E10D0">
+            <wp:extent cx="6858000" cy="659765"/>
+            <wp:effectExtent l="0" t="0" r="0" b="6985"/>
+            <wp:docPr id="986309596" name="Picture 1"/>
+            <wp:cNvGraphicFramePr>
+              <a:graphicFrameLocks xmlns:a="http://schemas.openxmlformats.org/drawingml/2006/main" noChangeAspect="1"/>
+            </wp:cNvGraphicFramePr>
+            <a:graphic xmlns:a="http://schemas.openxmlformats.org/drawingml/2006/main">
+              <a:graphicData uri="http://schemas.openxmlformats.org/drawingml/2006/picture">
+                <pic:pic xmlns:pic="http://schemas.openxmlformats.org/drawingml/2006/picture">
+                  <pic:nvPicPr>
+                    <pic:cNvPr id="986309596" name=""/>
+                    <pic:cNvPicPr/>
+                  </pic:nvPicPr>
+                  <pic:blipFill>
+                    <a:blip r:embed="rId7"/>
+                    <a:stretch>
+                      <a:fillRect/>
+                    </a:stretch>
+                  </pic:blipFill>
+                  <pic:spPr>
+                    <a:xfrm>
+                      <a:off x="0" y="0"/>
+                      <a:ext cx="6858000" cy="659765"/>
+                    </a:xfrm>
+                    <a:prstGeom prst="rect">
+                      <a:avLst/>
+                    </a:prstGeom>
+                  </pic:spPr>
+                </pic:pic>
+              </a:graphicData>
+            </a:graphic>
+          </wp:inline>
+        </w:drawing>
+      </w:r>
+    </w:p>
+    <w:p>
+      <w:r>
+        <w:rPr>
+          <w:noProof/>
+          <w14:ligatures w14:val="standardContextual"/>
+        </w:rPr>
+        <w:lastRenderedPageBreak/>
+        <w:drawing>
+          <wp:inline distT="0" distB="0" distL="0" distR="0" wp14:anchorId="109CE513" wp14:editId="6E0CBEE0">
+            <wp:extent cx="2380952" cy="5428571"/>
+            <wp:effectExtent l="0" t="0" r="635" b="1270"/>
+            <wp:docPr id="82641363" name="Picture 1"/>
+            <wp:cNvGraphicFramePr>
+              <a:graphicFrameLocks xmlns:a="http://schemas.openxmlformats.org/drawingml/2006/main" noChangeAspect="1"/>
+            </wp:cNvGraphicFramePr>
+            <a:graphic xmlns:a="http://schemas.openxmlformats.org/drawingml/2006/main">
+              <a:graphicData uri="http://schemas.openxmlformats.org/drawingml/2006/picture">
+                <pic:pic xmlns:pic="http://schemas.openxmlformats.org/drawingml/2006/picture">
+                  <pic:nvPicPr>
+                    <pic:cNvPr id="82641363" name=""/>
+                    <pic:cNvPicPr/>
+                  </pic:nvPicPr>
+                  <pic:blipFill>
+                    <a:blip r:embed="rId8"/>
+                    <a:stretch>
+                      <a:fillRect/>
+                    </a:stretch>
+                  </pic:blipFill>
+                  <pic:spPr>
+                    <a:xfrm>
+                      <a:off x="0" y="0"/>
+                      <a:ext cx="2380952" cy="5428571"/>
+                    </a:xfrm>
+                    <a:prstGeom prst="rect">
+                      <a:avLst/>
+                    </a:prstGeom>
+                  </pic:spPr>
+                </pic:pic>
+              </a:graphicData>
+            </a:graphic>
+          </wp:inline>
+        </w:drawing>
+      </w:r>
+    </w:p>
+    <w:p>
+      <w:pPr>
+        <w:pStyle w:val="IntenseQuote"/>
+      </w:pPr>
+      <w:proofErr w:type="spellStart"/>
+      <w:r>
+        <w:t>NakedPuts</w:t>
+      </w:r>
+      <w:proofErr w:type="spellEnd"/>
+      <w:r>
+        <w:t xml:space="preserve"> By Open GTC Orders</w:t>
+      </w:r>
+    </w:p>
+    <w:p>
+      <w:r>
+        <w:t xml:space="preserve">This is the view I start my day with. The puts aren’t really Naked though; they are Cash Secured short puts. It  shows all open short puts sorted first by their calculated </w:t>
+      </w:r>
+      <w:proofErr w:type="spellStart"/>
+      <w:r>
+        <w:t>BuybackCutoffDate</w:t>
+      </w:r>
+      <w:proofErr w:type="spellEnd"/>
+      <w:r>
+        <w:t>, and then by their amount of total Exposure to the portfolio</w:t>
+      </w:r>
+      <w:r>
+        <w:t xml:space="preserve">. </w:t>
+      </w:r>
+    </w:p>
+    <w:p>
+      <w:r>
+        <w:rPr>
+          <w:noProof/>
+          <w14:ligatures w14:val="standardContextual"/>
+        </w:rPr>
+        <w:drawing>
+          <wp:inline distT="0" distB="0" distL="0" distR="0" wp14:anchorId="11F7285C" wp14:editId="2155B1CF">
+            <wp:extent cx="6858000" cy="576580"/>
+            <wp:effectExtent l="0" t="0" r="0" b="0"/>
+            <wp:docPr id="1713584489" name="Picture 1"/>
+            <wp:cNvGraphicFramePr>
+              <a:graphicFrameLocks xmlns:a="http://schemas.openxmlformats.org/drawingml/2006/main" noChangeAspect="1"/>
+            </wp:cNvGraphicFramePr>
+            <a:graphic xmlns:a="http://schemas.openxmlformats.org/drawingml/2006/main">
+              <a:graphicData uri="http://schemas.openxmlformats.org/drawingml/2006/picture">
+                <pic:pic xmlns:pic="http://schemas.openxmlformats.org/drawingml/2006/picture">
+                  <pic:nvPicPr>
+                    <pic:cNvPr id="1713584489" name=""/>
+                    <pic:cNvPicPr/>
+                  </pic:nvPicPr>
+                  <pic:blipFill>
+                    <a:blip r:embed="rId9"/>
+                    <a:stretch>
+                      <a:fillRect/>
+                    </a:stretch>
+                  </pic:blipFill>
+                  <pic:spPr>
+                    <a:xfrm>
+                      <a:off x="0" y="0"/>
+                      <a:ext cx="6858000" cy="576580"/>
+                    </a:xfrm>
+                    <a:prstGeom prst="rect">
+                      <a:avLst/>
+                    </a:prstGeom>
+                  </pic:spPr>
+                </pic:pic>
+              </a:graphicData>
+            </a:graphic>
+          </wp:inline>
+        </w:drawing>
+      </w:r>
+    </w:p>
+    <w:p>
+      <w:r>
+        <w:rPr>
+          <w:noProof/>
+          <w14:ligatures w14:val="standardContextual"/>
+        </w:rPr>
+        <w:drawing>
+          <wp:inline distT="0" distB="0" distL="0" distR="0" wp14:anchorId="39F9B743" wp14:editId="393BA821">
+            <wp:extent cx="6858000" cy="592455"/>
+            <wp:effectExtent l="0" t="0" r="0" b="0"/>
+            <wp:docPr id="745171735" name="Picture 1"/>
+            <wp:cNvGraphicFramePr>
+              <a:graphicFrameLocks xmlns:a="http://schemas.openxmlformats.org/drawingml/2006/main" noChangeAspect="1"/>
+            </wp:cNvGraphicFramePr>
+            <a:graphic xmlns:a="http://schemas.openxmlformats.org/drawingml/2006/main">
+              <a:graphicData uri="http://schemas.openxmlformats.org/drawingml/2006/picture">
+                <pic:pic xmlns:pic="http://schemas.openxmlformats.org/drawingml/2006/picture">
+                  <pic:nvPicPr>
+                    <pic:cNvPr id="745171735" name=""/>
+                    <pic:cNvPicPr/>
+                  </pic:nvPicPr>
+                  <pic:blipFill>
+                    <a:blip r:embed="rId10"/>
+                    <a:stretch>
+                      <a:fillRect/>
+                    </a:stretch>
+                  </pic:blipFill>
+                  <pic:spPr>
+                    <a:xfrm>
+                      <a:off x="0" y="0"/>
+                      <a:ext cx="6858000" cy="592455"/>
+                    </a:xfrm>
+                    <a:prstGeom prst="rect">
+                      <a:avLst/>
+                    </a:prstGeom>
+                  </pic:spPr>
+                </pic:pic>
+              </a:graphicData>
+            </a:graphic>
+          </wp:inline>
+        </w:drawing>
+      </w:r>
+    </w:p>
+    <w:p>
+      <w:r>
+        <w:t>I’ve broken that top line for ticker ONDS into two just so it stays large enough for you to read it.</w:t>
+      </w:r>
+    </w:p>
+    <w:p>
+      <w:pPr>
+        <w:keepNext/>
+      </w:pPr>
+      <w:r>
+        <w:lastRenderedPageBreak/>
+        <w:t>The other reason I start with this view is it tells me what my cash on hand is by Account and how that relates to total put liability</w:t>
+      </w:r>
+      <w:r>
+        <w:t>.</w:t>
+      </w:r>
+    </w:p>
+    <w:p>
+      <w:r>
+        <w:rPr>
+          <w:noProof/>
+          <w14:ligatures w14:val="standardContextual"/>
+        </w:rPr>
+        <w:drawing>
+          <wp:inline distT="0" distB="0" distL="0" distR="0" wp14:anchorId="26DCE408" wp14:editId="0324CE64">
+            <wp:extent cx="1600000" cy="2352381"/>
+            <wp:effectExtent l="0" t="0" r="635" b="0"/>
+            <wp:docPr id="1495537812" name="Picture 1"/>
+            <wp:cNvGraphicFramePr>
+              <a:graphicFrameLocks xmlns:a="http://schemas.openxmlformats.org/drawingml/2006/main" noChangeAspect="1"/>
+            </wp:cNvGraphicFramePr>
+            <a:graphic xmlns:a="http://schemas.openxmlformats.org/drawingml/2006/main">
+              <a:graphicData uri="http://schemas.openxmlformats.org/drawingml/2006/picture">
+                <pic:pic xmlns:pic="http://schemas.openxmlformats.org/drawingml/2006/picture">
+                  <pic:nvPicPr>
+                    <pic:cNvPr id="1495537812" name=""/>
+                    <pic:cNvPicPr/>
+                  </pic:nvPicPr>
+                  <pic:blipFill>
+                    <a:blip r:embed="rId11"/>
+                    <a:stretch>
+                      <a:fillRect/>
+                    </a:stretch>
+                  </pic:blipFill>
+                  <pic:spPr>
+                    <a:xfrm>
+                      <a:off x="0" y="0"/>
+                      <a:ext cx="1600000" cy="2352381"/>
+                    </a:xfrm>
+                    <a:prstGeom prst="rect">
+                      <a:avLst/>
+                    </a:prstGeom>
+                  </pic:spPr>
+                </pic:pic>
+              </a:graphicData>
+            </a:graphic>
+          </wp:inline>
+        </w:drawing>
+      </w:r>
+    </w:p>
+    <w:p>
+      <w:pPr>
+        <w:pStyle w:val="IntenseQuote"/>
+      </w:pPr>
+      <w:proofErr w:type="spellStart"/>
+      <w:proofErr w:type="gramStart"/>
+      <w:r>
+        <w:t>CoveredCalls</w:t>
+      </w:r>
+      <w:proofErr w:type="spellEnd"/>
+      <w:proofErr w:type="gramEnd"/>
+      <w:r>
+        <w:t xml:space="preserve"> </w:t>
+      </w:r>
+      <w:r>
+        <w:t>By Open GTC Orders</w:t>
+      </w:r>
+    </w:p>
+    <w:p>
+      <w:r>
+        <w:t xml:space="preserve">All open short calls </w:t>
+      </w:r>
+      <w:r>
+        <w:t xml:space="preserve">sorted first by </w:t>
+      </w:r>
+      <w:proofErr w:type="spellStart"/>
+      <w:r>
+        <w:t>BuybackCutoffDate</w:t>
+      </w:r>
+      <w:proofErr w:type="spellEnd"/>
+      <w:r>
+        <w:t>, then by Expiration Date, and then by underlying Symbol</w:t>
+      </w:r>
+    </w:p>
+    <w:p>
+      <w:r>
+        <w:rPr>
+          <w:noProof/>
+          <w14:ligatures w14:val="standardContextual"/>
+        </w:rPr>
+        <w:drawing>
+          <wp:inline distT="0" distB="0" distL="0" distR="0" wp14:anchorId="15B75C97" wp14:editId="29506DDE">
+            <wp:extent cx="6858000" cy="654050"/>
+            <wp:effectExtent l="0" t="0" r="0" b="0"/>
+            <wp:docPr id="1593614987" name="Picture 1"/>
+            <wp:cNvGraphicFramePr>
+              <a:graphicFrameLocks xmlns:a="http://schemas.openxmlformats.org/drawingml/2006/main" noChangeAspect="1"/>
+            </wp:cNvGraphicFramePr>
+            <a:graphic xmlns:a="http://schemas.openxmlformats.org/drawingml/2006/main">
+              <a:graphicData uri="http://schemas.openxmlformats.org/drawingml/2006/picture">
+                <pic:pic xmlns:pic="http://schemas.openxmlformats.org/drawingml/2006/picture">
+                  <pic:nvPicPr>
+                    <pic:cNvPr id="1593614987" name=""/>
+                    <pic:cNvPicPr/>
+                  </pic:nvPicPr>
+                  <pic:blipFill>
+                    <a:blip r:embed="rId12"/>
+                    <a:stretch>
+                      <a:fillRect/>
+                    </a:stretch>
+                  </pic:blipFill>
+                  <pic:spPr>
+                    <a:xfrm>
+                      <a:off x="0" y="0"/>
+                      <a:ext cx="6858000" cy="654050"/>
+                    </a:xfrm>
+                    <a:prstGeom prst="rect">
+                      <a:avLst/>
+                    </a:prstGeom>
+                  </pic:spPr>
+                </pic:pic>
+              </a:graphicData>
+            </a:graphic>
+          </wp:inline>
+        </w:drawing>
+      </w:r>
+    </w:p>
+    <w:p>
+      <w:r>
+        <w:rPr>
+          <w:noProof/>
+          <w14:ligatures w14:val="standardContextual"/>
+        </w:rPr>
+        <w:drawing>
+          <wp:inline distT="0" distB="0" distL="0" distR="0" wp14:anchorId="0E2E5C9E" wp14:editId="7D1D6933">
+            <wp:extent cx="6858000" cy="668020"/>
+            <wp:effectExtent l="0" t="0" r="0" b="0"/>
+            <wp:docPr id="121415245" name="Picture 1"/>
+            <wp:cNvGraphicFramePr>
+              <a:graphicFrameLocks xmlns:a="http://schemas.openxmlformats.org/drawingml/2006/main" noChangeAspect="1"/>
+            </wp:cNvGraphicFramePr>
+            <a:graphic xmlns:a="http://schemas.openxmlformats.org/drawingml/2006/main">
+              <a:graphicData uri="http://schemas.openxmlformats.org/drawingml/2006/picture">
+                <pic:pic xmlns:pic="http://schemas.openxmlformats.org/drawingml/2006/picture">
+                  <pic:nvPicPr>
+                    <pic:cNvPr id="121415245" name=""/>
+                    <pic:cNvPicPr/>
+                  </pic:nvPicPr>
+                  <pic:blipFill>
+                    <a:blip r:embed="rId13"/>
+                    <a:stretch>
+                      <a:fillRect/>
+                    </a:stretch>
+                  </pic:blipFill>
+                  <pic:spPr>
+                    <a:xfrm>
+                      <a:off x="0" y="0"/>
+                      <a:ext cx="6858000" cy="668020"/>
+                    </a:xfrm>
+                    <a:prstGeom prst="rect">
+                      <a:avLst/>
+                    </a:prstGeom>
+                  </pic:spPr>
+                </pic:pic>
+              </a:graphicData>
+            </a:graphic>
+          </wp:inline>
+        </w:drawing>
+      </w:r>
+    </w:p>
+    <w:p>
+      <w:r>
+        <w:rPr>
+          <w:noProof/>
+          <w14:ligatures w14:val="standardContextual"/>
+        </w:rPr>
+        <w:drawing>
+          <wp:inline distT="0" distB="0" distL="0" distR="0" wp14:anchorId="277AA5C0" wp14:editId="37FF4356">
+            <wp:extent cx="6858000" cy="810260"/>
+            <wp:effectExtent l="0" t="0" r="0" b="8890"/>
+            <wp:docPr id="781293120" name="Picture 1"/>
+            <wp:cNvGraphicFramePr>
+              <a:graphicFrameLocks xmlns:a="http://schemas.openxmlformats.org/drawingml/2006/main" noChangeAspect="1"/>
+            </wp:cNvGraphicFramePr>
+            <a:graphic xmlns:a="http://schemas.openxmlformats.org/drawingml/2006/main">
+              <a:graphicData uri="http://schemas.openxmlformats.org/drawingml/2006/picture">
+                <pic:pic xmlns:pic="http://schemas.openxmlformats.org/drawingml/2006/picture">
+                  <pic:nvPicPr>
+                    <pic:cNvPr id="781293120" name=""/>
+                    <pic:cNvPicPr/>
+                  </pic:nvPicPr>
+                  <pic:blipFill>
+                    <a:blip r:embed="rId14"/>
+                    <a:stretch>
+                      <a:fillRect/>
+                    </a:stretch>
+                  </pic:blipFill>
+                  <pic:spPr>
+                    <a:xfrm>
+                      <a:off x="0" y="0"/>
+                      <a:ext cx="6858000" cy="810260"/>
+                    </a:xfrm>
+                    <a:prstGeom prst="rect">
+                      <a:avLst/>
+                    </a:prstGeom>
+                  </pic:spPr>
+                </pic:pic>
+              </a:graphicData>
+            </a:graphic>
+          </wp:inline>
+        </w:drawing>
+      </w:r>
+    </w:p>
+    <w:p>
+      <w:r>
+        <w:t xml:space="preserve">Again the top line </w:t>
+      </w:r>
+      <w:r>
+        <w:t xml:space="preserve">has been </w:t>
+      </w:r>
+      <w:r>
+        <w:t xml:space="preserve">broken out to make it readable. </w:t>
+      </w:r>
+    </w:p>
+    <w:p>
+      <w:pPr>
+        <w:pStyle w:val="IntenseQuote"/>
+      </w:pPr>
+      <w:proofErr w:type="spellStart"/>
+      <w:r>
+        <w:t>CoveredCalls</w:t>
+      </w:r>
+      <w:proofErr w:type="spellEnd"/>
+      <w:r>
+        <w:t xml:space="preserve"> </w:t>
+      </w:r>
+      <w:r>
+        <w:t>Available to Sell</w:t>
+      </w:r>
+    </w:p>
+    <w:p>
+      <w:r>
+        <w:t>A favorite view to look at early in the week, shows uncovered positions sorted  by position exposure size</w:t>
+      </w:r>
+    </w:p>
+    <w:p>
+      <w:r>
+        <w:rPr>
+          <w:noProof/>
+          <w14:ligatures w14:val="standardContextual"/>
+        </w:rPr>
+        <w:drawing>
+          <wp:inline distT="0" distB="0" distL="0" distR="0" wp14:anchorId="5A48E75E" wp14:editId="49EFFA1E">
+            <wp:extent cx="6858000" cy="1188720"/>
+            <wp:effectExtent l="0" t="0" r="0" b="0"/>
+            <wp:docPr id="1669452420" name="Picture 1"/>
+            <wp:cNvGraphicFramePr>
+              <a:graphicFrameLocks xmlns:a="http://schemas.openxmlformats.org/drawingml/2006/main" noChangeAspect="1"/>
+            </wp:cNvGraphicFramePr>
+            <a:graphic xmlns:a="http://schemas.openxmlformats.org/drawingml/2006/main">
+              <a:graphicData uri="http://schemas.openxmlformats.org/drawingml/2006/picture">
+                <pic:pic xmlns:pic="http://schemas.openxmlformats.org/drawingml/2006/picture">
+                  <pic:nvPicPr>
+                    <pic:cNvPr id="1669452420" name=""/>
+                    <pic:cNvPicPr/>
+                  </pic:nvPicPr>
+                  <pic:blipFill>
+                    <a:blip r:embed="rId15"/>
+                    <a:stretch>
+                      <a:fillRect/>
+                    </a:stretch>
+                  </pic:blipFill>
+                  <pic:spPr>
+                    <a:xfrm>
+                      <a:off x="0" y="0"/>
+                      <a:ext cx="6858000" cy="1188720"/>
+                    </a:xfrm>
+                    <a:prstGeom prst="rect">
+                      <a:avLst/>
+                    </a:prstGeom>
+                  </pic:spPr>
+                </pic:pic>
+              </a:graphicData>
+            </a:graphic>
+          </wp:inline>
+        </w:drawing>
+      </w:r>
+    </w:p>
+    <w:p>
+      <w:pPr>
+        <w:pStyle w:val="SargeHeader"/>
+      </w:pPr>
+      <w:r>
+        <w:lastRenderedPageBreak/>
+        <w:t>Recording Data – FCX_20</w:t>
+      </w:r>
+    </w:p>
+    <w:p>
+      <w:pPr>
+        <w:pStyle w:val="IntenseQuote"/>
+      </w:pPr>
+      <w:r>
+        <w:t>Opening the position with two LEAPs</w:t>
+      </w:r>
+    </w:p>
+    <w:p>
+      <w:pPr>
+        <w:pStyle w:val="ListParagraph"/>
+        <w:numPr>
+          <w:ilvl w:val="0"/>
+          <w:numId w:val="3"/>
+        </w:numPr>
+      </w:pPr>
+      <w:r>
+        <w:t>Two tranches of Jan-21, 2028 LEAPs are bought on the same day at different times and for different prices and recorded as two line-items in CAGR. The Proceeds are left at zero</w:t>
+      </w:r>
+    </w:p>
+    <w:p>
+      <w:pPr>
+        <w:pStyle w:val="ListParagraph"/>
+        <w:numPr>
+          <w:ilvl w:val="1"/>
+          <w:numId w:val="3"/>
+        </w:numPr>
+      </w:pPr>
+      <w:r>
+        <w:t>You can’t tell the year from the description</w:t>
+      </w:r>
+    </w:p>
+    <w:p>
+      <w:pPr>
+        <w:pStyle w:val="ListParagraph"/>
+        <w:numPr>
+          <w:ilvl w:val="1"/>
+          <w:numId w:val="3"/>
+        </w:numPr>
+      </w:pPr>
+      <w:r>
+        <w:t xml:space="preserve">A PLUG line with a PLUG Type of MTM (mark to market) is established to </w:t>
+      </w:r>
+      <w:r>
+        <w:t>track</w:t>
+      </w:r>
+      <w:r>
+        <w:t xml:space="preserve"> the </w:t>
+      </w:r>
+      <w:r>
+        <w:t xml:space="preserve">value of the position. In practice, because this is manual it is usually out of sync. </w:t>
+      </w:r>
+      <w:proofErr w:type="spellStart"/>
+      <w:r>
+        <w:t>YFinance</w:t>
+      </w:r>
+      <w:proofErr w:type="spellEnd"/>
+      <w:r>
+        <w:t xml:space="preserve"> would cover most scenarios and is free. I’m willing to pay for data or better yet just use feed from </w:t>
+      </w:r>
+      <w:proofErr w:type="spellStart"/>
+      <w:r>
+        <w:t>IBroker</w:t>
+      </w:r>
+      <w:proofErr w:type="spellEnd"/>
+      <w:r>
+        <w:t xml:space="preserve"> once I switch to them.</w:t>
+      </w:r>
+    </w:p>
+    <w:p>
+      <w:pPr>
+        <w:pStyle w:val="ListParagraph"/>
+        <w:numPr>
+          <w:ilvl w:val="0"/>
+          <w:numId w:val="3"/>
+        </w:numPr>
+      </w:pPr>
+      <w:r>
+        <w:t xml:space="preserve">The line is manually reentered (consolidated) into </w:t>
+      </w:r>
+      <w:r>
+        <w:t>SNAPSHO</w:t>
+      </w:r>
+      <w:r>
+        <w:t>T</w:t>
+      </w:r>
+      <w:r>
+        <w:t xml:space="preserve">, see below. The BIG thing I care about </w:t>
+      </w:r>
+      <w:r>
+        <w:t xml:space="preserve">is </w:t>
+      </w:r>
+      <w:r>
+        <w:t xml:space="preserve">that computed </w:t>
+      </w:r>
+      <w:r>
+        <w:t>ACB</w:t>
+      </w:r>
+      <w:r>
+        <w:t xml:space="preserve"> </w:t>
+      </w:r>
+      <w:r>
+        <w:t>from CAGR</w:t>
+      </w:r>
+      <w:r>
+        <w:t>.</w:t>
+      </w:r>
+    </w:p>
+    <w:p>
+      <w:r>
+        <w:rPr>
+          <w:noProof/>
+        </w:rPr>
+        <w:drawing>
+          <wp:inline distT="0" distB="0" distL="0" distR="0" wp14:anchorId="749898BE" wp14:editId="64C23F8D">
+            <wp:extent cx="6858000" cy="751840"/>
+            <wp:effectExtent l="0" t="0" r="0" b="0"/>
+            <wp:docPr id="759002627" name="Picture 1"/>
+            <wp:cNvGraphicFramePr>
+              <a:graphicFrameLocks xmlns:a="http://schemas.openxmlformats.org/drawingml/2006/main" noChangeAspect="1"/>
+            </wp:cNvGraphicFramePr>
+            <a:graphic xmlns:a="http://schemas.openxmlformats.org/drawingml/2006/main">
+              <a:graphicData uri="http://schemas.openxmlformats.org/drawingml/2006/picture">
+                <pic:pic xmlns:pic="http://schemas.openxmlformats.org/drawingml/2006/picture">
+                  <pic:nvPicPr>
+                    <pic:cNvPr id="759002627" name=""/>
+                    <pic:cNvPicPr/>
+                  </pic:nvPicPr>
+                  <pic:blipFill>
+                    <a:blip r:embed="rId16"/>
+                    <a:stretch>
+                      <a:fillRect/>
+                    </a:stretch>
+                  </pic:blipFill>
+                  <pic:spPr>
+                    <a:xfrm>
+                      <a:off x="0" y="0"/>
+                      <a:ext cx="6858000" cy="751840"/>
+                    </a:xfrm>
+                    <a:prstGeom prst="rect">
+                      <a:avLst/>
+                    </a:prstGeom>
+                  </pic:spPr>
+                </pic:pic>
+              </a:graphicData>
+            </a:graphic>
+          </wp:inline>
+        </w:drawing>
+      </w:r>
+    </w:p>
+    <w:p>
+      <w:r>
+        <w:rPr>
+          <w:noProof/>
+          <w14:ligatures w14:val="standardContextual"/>
+        </w:rPr>
+        <w:drawing>
+          <wp:inline distT="0" distB="0" distL="0" distR="0" wp14:anchorId="38ED512D" wp14:editId="486C58B0">
+            <wp:extent cx="6858000" cy="824230"/>
+            <wp:effectExtent l="0" t="0" r="0" b="0"/>
+            <wp:docPr id="450431377" name="Picture 1"/>
+            <wp:cNvGraphicFramePr>
+              <a:graphicFrameLocks xmlns:a="http://schemas.openxmlformats.org/drawingml/2006/main" noChangeAspect="1"/>
+            </wp:cNvGraphicFramePr>
+            <a:graphic xmlns:a="http://schemas.openxmlformats.org/drawingml/2006/main">
+              <a:graphicData uri="http://schemas.openxmlformats.org/drawingml/2006/picture">
+                <pic:pic xmlns:pic="http://schemas.openxmlformats.org/drawingml/2006/picture">
+                  <pic:nvPicPr>
+                    <pic:cNvPr id="450431377" name=""/>
+                    <pic:cNvPicPr/>
+                  </pic:nvPicPr>
+                  <pic:blipFill>
+                    <a:blip r:embed="rId17"/>
+                    <a:stretch>
+                      <a:fillRect/>
+                    </a:stretch>
+                  </pic:blipFill>
+                  <pic:spPr>
+                    <a:xfrm>
+                      <a:off x="0" y="0"/>
+                      <a:ext cx="6858000" cy="824230"/>
+                    </a:xfrm>
+                    <a:prstGeom prst="rect">
+                      <a:avLst/>
+                    </a:prstGeom>
+                  </pic:spPr>
+                </pic:pic>
+              </a:graphicData>
+            </a:graphic>
+          </wp:inline>
+        </w:drawing>
+      </w:r>
+    </w:p>
+    <w:p>
+      <w:pPr>
+        <w:pStyle w:val="IntenseQuote"/>
+      </w:pPr>
+      <w:r>
+        <w:t xml:space="preserve">Adding </w:t>
+      </w:r>
+      <w:r>
+        <w:t>Short</w:t>
+      </w:r>
+      <w:r>
+        <w:t xml:space="preserve"> Calls</w:t>
+      </w:r>
+    </w:p>
+    <w:p>
+      <w:pPr>
+        <w:pStyle w:val="ListParagraph"/>
+        <w:numPr>
+          <w:ilvl w:val="0"/>
+          <w:numId w:val="4"/>
+        </w:numPr>
+      </w:pPr>
+      <w:r>
+        <w:t>I will show the most recent line item added on June-22, 2026</w:t>
+      </w:r>
+    </w:p>
+    <w:p>
+      <w:pPr>
+        <w:pStyle w:val="ListParagraph"/>
+        <w:numPr>
+          <w:ilvl w:val="1"/>
+          <w:numId w:val="4"/>
+        </w:numPr>
+      </w:pPr>
+      <w:r>
+        <w:t>You can also see another PLUG, this time with CLL type, showing where our value is capped. The system should do this. It should also cap the MTM value</w:t>
+      </w:r>
+    </w:p>
+    <w:p>
+      <w:pPr>
+        <w:ind w:left="360"/>
+      </w:pPr>
+      <w:r>
+        <w:rPr>
+          <w:noProof/>
+        </w:rPr>
+        <w:drawing>
+          <wp:inline distT="0" distB="0" distL="0" distR="0" wp14:anchorId="009716C6" wp14:editId="7DA5F62E">
+            <wp:extent cx="6858000" cy="511810"/>
+            <wp:effectExtent l="0" t="0" r="0" b="2540"/>
+            <wp:docPr id="139688575" name="Picture 1"/>
+            <wp:cNvGraphicFramePr>
+              <a:graphicFrameLocks xmlns:a="http://schemas.openxmlformats.org/drawingml/2006/main" noChangeAspect="1"/>
+            </wp:cNvGraphicFramePr>
+            <a:graphic xmlns:a="http://schemas.openxmlformats.org/drawingml/2006/main">
+              <a:graphicData uri="http://schemas.openxmlformats.org/drawingml/2006/picture">
+                <pic:pic xmlns:pic="http://schemas.openxmlformats.org/drawingml/2006/picture">
+                  <pic:nvPicPr>
+                    <pic:cNvPr id="139688575" name=""/>
+                    <pic:cNvPicPr/>
+                  </pic:nvPicPr>
+                  <pic:blipFill>
+                    <a:blip r:embed="rId18"/>
+                    <a:stretch>
+                      <a:fillRect/>
+                    </a:stretch>
+                  </pic:blipFill>
+                  <pic:spPr>
+                    <a:xfrm>
+                      <a:off x="0" y="0"/>
+                      <a:ext cx="6858000" cy="511810"/>
+                    </a:xfrm>
+                    <a:prstGeom prst="rect">
+                      <a:avLst/>
+                    </a:prstGeom>
+                  </pic:spPr>
+                </pic:pic>
+              </a:graphicData>
+            </a:graphic>
+          </wp:inline>
+        </w:drawing>
+      </w:r>
+    </w:p>
+    <w:p>
+      <w:pPr>
+        <w:pStyle w:val="ListParagraph"/>
+        <w:numPr>
+          <w:ilvl w:val="0"/>
+          <w:numId w:val="4"/>
+        </w:numPr>
+      </w:pPr>
+      <w:r>
+        <w:t xml:space="preserve">The call info is for the most part duplicated </w:t>
+      </w:r>
+      <w:r>
+        <w:t xml:space="preserve">in </w:t>
+      </w:r>
+      <w:r>
+        <w:t>SNAPSHOT</w:t>
+      </w:r>
+      <w:r>
+        <w:t xml:space="preserve"> </w:t>
+      </w:r>
+      <w:r>
+        <w:t>with some notable additional information, notably the entry delta</w:t>
+      </w:r>
+    </w:p>
+    <w:p>
+      <w:pPr>
+        <w:jc w:val="both"/>
+      </w:pPr>
+      <w:r>
+        <w:rPr>
+          <w:noProof/>
+        </w:rPr>
+        <w:drawing>
+          <wp:inline distT="0" distB="0" distL="0" distR="0" wp14:anchorId="7A7FE9BA" wp14:editId="7AD43FA9">
+            <wp:extent cx="6858000" cy="934720"/>
+            <wp:effectExtent l="0" t="0" r="0" b="0"/>
+            <wp:docPr id="865142054" name="Picture 1"/>
+            <wp:cNvGraphicFramePr>
+              <a:graphicFrameLocks xmlns:a="http://schemas.openxmlformats.org/drawingml/2006/main" noChangeAspect="1"/>
+            </wp:cNvGraphicFramePr>
+            <a:graphic xmlns:a="http://schemas.openxmlformats.org/drawingml/2006/main">
+              <a:graphicData uri="http://schemas.openxmlformats.org/drawingml/2006/picture">
+                <pic:pic xmlns:pic="http://schemas.openxmlformats.org/drawingml/2006/picture">
+                  <pic:nvPicPr>
+                    <pic:cNvPr id="865142054" name=""/>
+                    <pic:cNvPicPr/>
+                  </pic:nvPicPr>
+                  <pic:blipFill>
+                    <a:blip r:embed="rId19"/>
+                    <a:stretch>
+                      <a:fillRect/>
+                    </a:stretch>
+                  </pic:blipFill>
+                  <pic:spPr>
+                    <a:xfrm>
+                      <a:off x="0" y="0"/>
+                      <a:ext cx="6858000" cy="934720"/>
+                    </a:xfrm>
+                    <a:prstGeom prst="rect">
+                      <a:avLst/>
+                    </a:prstGeom>
+                  </pic:spPr>
+                </pic:pic>
+              </a:graphicData>
+            </a:graphic>
+          </wp:inline>
+        </w:drawing>
+      </w:r>
+    </w:p>
+    <w:p>
+      <w:pPr>
+        <w:jc w:val="both"/>
+      </w:pPr>
+      <w:r>
+        <w:rPr>
+          <w:noProof/>
+          <w14:ligatures w14:val="standardContextual"/>
+        </w:rPr>
+        <w:drawing>
+          <wp:inline distT="0" distB="0" distL="0" distR="0" wp14:anchorId="69CEA52E" wp14:editId="166A2490">
+            <wp:extent cx="6858000" cy="694690"/>
+            <wp:effectExtent l="0" t="0" r="0" b="0"/>
+            <wp:docPr id="1012105001" name="Picture 1"/>
+            <wp:cNvGraphicFramePr>
+              <a:graphicFrameLocks xmlns:a="http://schemas.openxmlformats.org/drawingml/2006/main" noChangeAspect="1"/>
+            </wp:cNvGraphicFramePr>
+            <a:graphic xmlns:a="http://schemas.openxmlformats.org/drawingml/2006/main">
+              <a:graphicData uri="http://schemas.openxmlformats.org/drawingml/2006/picture">
+                <pic:pic xmlns:pic="http://schemas.openxmlformats.org/drawingml/2006/picture">
+                  <pic:nvPicPr>
+                    <pic:cNvPr id="1012105001" name=""/>
+                    <pic:cNvPicPr/>
+                  </pic:nvPicPr>
+                  <pic:blipFill>
+                    <a:blip r:embed="rId20"/>
+                    <a:stretch>
+                      <a:fillRect/>
+                    </a:stretch>
+                  </pic:blipFill>
+                  <pic:spPr>
+                    <a:xfrm>
+                      <a:off x="0" y="0"/>
+                      <a:ext cx="6858000" cy="694690"/>
+                    </a:xfrm>
+                    <a:prstGeom prst="rect">
+                      <a:avLst/>
+                    </a:prstGeom>
+                  </pic:spPr>
+                </pic:pic>
+              </a:graphicData>
+            </a:graphic>
+          </wp:inline>
+        </w:drawing>
+      </w:r>
+    </w:p>
+    <w:p>
+      <w:pPr>
+        <w:jc w:val="both"/>
+      </w:pPr>
+      <w:r>
+        <w:rPr>
+          <w:noProof/>
+          <w14:ligatures w14:val="standardContextual"/>
+        </w:rPr>
+        <w:lastRenderedPageBreak/>
+        <w:drawing>
+          <wp:inline distT="0" distB="0" distL="0" distR="0" wp14:anchorId="544920B0" wp14:editId="39CABA42">
+            <wp:extent cx="6858000" cy="1174750"/>
+            <wp:effectExtent l="0" t="0" r="0" b="6350"/>
+            <wp:docPr id="328968419" name="Picture 1"/>
+            <wp:cNvGraphicFramePr>
+              <a:graphicFrameLocks xmlns:a="http://schemas.openxmlformats.org/drawingml/2006/main" noChangeAspect="1"/>
+            </wp:cNvGraphicFramePr>
+            <a:graphic xmlns:a="http://schemas.openxmlformats.org/drawingml/2006/main">
+              <a:graphicData uri="http://schemas.openxmlformats.org/drawingml/2006/picture">
+                <pic:pic xmlns:pic="http://schemas.openxmlformats.org/drawingml/2006/picture">
+                  <pic:nvPicPr>
+                    <pic:cNvPr id="328968419" name=""/>
+                    <pic:cNvPicPr/>
+                  </pic:nvPicPr>
+                  <pic:blipFill>
+                    <a:blip r:embed="rId21"/>
+                    <a:stretch>
+                      <a:fillRect/>
+                    </a:stretch>
+                  </pic:blipFill>
+                  <pic:spPr>
+                    <a:xfrm>
+                      <a:off x="0" y="0"/>
+                      <a:ext cx="6858000" cy="1174750"/>
+                    </a:xfrm>
+                    <a:prstGeom prst="rect">
+                      <a:avLst/>
+                    </a:prstGeom>
+                  </pic:spPr>
+                </pic:pic>
+              </a:graphicData>
+            </a:graphic>
+          </wp:inline>
+        </w:drawing>
+      </w:r>
+    </w:p>
+    <w:p>
+      <w:pPr>
+        <w:jc w:val="both"/>
+      </w:pPr>
+      <w:r>
+        <w:t xml:space="preserve">Things  I use lots </w:t>
+      </w:r>
+      <w:r>
+        <w:t xml:space="preserve">in </w:t>
+      </w:r>
+      <w:r>
+        <w:t>SNAPSHOT</w:t>
+      </w:r>
+      <w:r>
+        <w:t xml:space="preserve"> </w:t>
+      </w:r>
+      <w:r>
+        <w:t xml:space="preserve">include the calculated Buyback point. If the entered Current Ask is equal to or below that </w:t>
+      </w:r>
+      <w:r>
+        <w:t>number,</w:t>
+      </w:r>
+      <w:r>
+        <w:t xml:space="preserve"> then conditional formatting will alert that the call is ok to be bought back.</w:t>
+      </w:r>
+      <w:r>
+        <w:t xml:space="preserve"> Again, a good system should populate the latest Ask and Delta either on demand or at regular intervals.</w:t>
+      </w:r>
+    </w:p>
+    <w:p>
+      <w:pPr>
+        <w:pStyle w:val="IntenseQuote"/>
+      </w:pPr>
+      <w:r>
+        <w:t>Adding</w:t>
+      </w:r>
+      <w:r>
+        <w:t xml:space="preserve"> &amp; Closing</w:t>
+      </w:r>
+      <w:r>
+        <w:t xml:space="preserve"> Short </w:t>
+      </w:r>
+      <w:r>
+        <w:t>Puts</w:t>
+      </w:r>
+    </w:p>
+    <w:p>
+      <w:r>
+        <w:t>Managing short puts in SNAPSHOT is similar to managing short calls. Below just show the closing out of the line items in CAGR (without the tedium of updating and/or deleting PLUG line-items!)</w:t>
+      </w:r>
+    </w:p>
+    <w:p>
+      <w:r>
+        <w:rPr>
+          <w:noProof/>
+          <w14:ligatures w14:val="standardContextual"/>
+        </w:rPr>
+        <w:drawing>
+          <wp:inline distT="0" distB="0" distL="0" distR="0" wp14:anchorId="35445408" wp14:editId="3A5CA2FA">
+            <wp:extent cx="6858000" cy="733425"/>
+            <wp:effectExtent l="0" t="0" r="0" b="9525"/>
+            <wp:docPr id="1838966398" name="Picture 1"/>
+            <wp:cNvGraphicFramePr>
+              <a:graphicFrameLocks xmlns:a="http://schemas.openxmlformats.org/drawingml/2006/main" noChangeAspect="1"/>
+            </wp:cNvGraphicFramePr>
+            <a:graphic xmlns:a="http://schemas.openxmlformats.org/drawingml/2006/main">
+              <a:graphicData uri="http://schemas.openxmlformats.org/drawingml/2006/picture">
+                <pic:pic xmlns:pic="http://schemas.openxmlformats.org/drawingml/2006/picture">
+                  <pic:nvPicPr>
+                    <pic:cNvPr id="1838966398" name=""/>
+                    <pic:cNvPicPr/>
+                  </pic:nvPicPr>
+                  <pic:blipFill>
+                    <a:blip r:embed="rId22"/>
+                    <a:stretch>
+                      <a:fillRect/>
+                    </a:stretch>
+                  </pic:blipFill>
+                  <pic:spPr>
+                    <a:xfrm>
+                      <a:off x="0" y="0"/>
+                      <a:ext cx="6858000" cy="733425"/>
+                    </a:xfrm>
+                    <a:prstGeom prst="rect">
+                      <a:avLst/>
+                    </a:prstGeom>
+                  </pic:spPr>
+                </pic:pic>
+              </a:graphicData>
+            </a:graphic>
+          </wp:inline>
+        </w:drawing>
+      </w:r>
+    </w:p>
+    <w:p>
+      <w:pPr>
+        <w:spacing w:line="278" w:lineRule="auto"/>
+        <w:rPr>
+          <w:i/>
+          <w:iCs/>
+          <w:color w:val="0F4761" w:themeColor="accent1" w:themeShade="BF"/>
+        </w:rPr>
+      </w:pPr>
+      <w:r>
+        <w:br w:type="page"/>
+      </w:r>
+    </w:p>
+    <w:p>
+      <w:pPr>
+        <w:pStyle w:val="IntenseQuote"/>
+      </w:pPr>
+      <w:r>
+        <w:lastRenderedPageBreak/>
+        <w:t xml:space="preserve">Adding </w:t>
+      </w:r>
+      <w:r>
+        <w:t>FCX 20 from Scratch</w:t>
+      </w:r>
+    </w:p>
+    <w:p>
+      <w:r>
+        <w:t>First CAGR step, use the Adder to add a New Trade, for Long Call(s)</w:t>
+      </w:r>
+    </w:p>
+    <w:p>
+      <w:r>
+        <w:rPr>
+          <w:noProof/>
+          <w14:ligatures w14:val="standardContextual"/>
+        </w:rPr>
+        <w:drawing>
+          <wp:inline distT="0" distB="0" distL="0" distR="0" wp14:anchorId="43352A9C" wp14:editId="69B0837A">
+            <wp:extent cx="2323809" cy="2980952"/>
+            <wp:effectExtent l="0" t="0" r="635" b="0"/>
+            <wp:docPr id="2008246573" name="Picture 1"/>
+            <wp:cNvGraphicFramePr>
+              <a:graphicFrameLocks xmlns:a="http://schemas.openxmlformats.org/drawingml/2006/main" noChangeAspect="1"/>
+            </wp:cNvGraphicFramePr>
+            <a:graphic xmlns:a="http://schemas.openxmlformats.org/drawingml/2006/main">
+              <a:graphicData uri="http://schemas.openxmlformats.org/drawingml/2006/picture">
+                <pic:pic xmlns:pic="http://schemas.openxmlformats.org/drawingml/2006/picture">
+                  <pic:nvPicPr>
+                    <pic:cNvPr id="2008246573" name=""/>
+                    <pic:cNvPicPr/>
+                  </pic:nvPicPr>
+                  <pic:blipFill>
+                    <a:blip r:embed="rId23"/>
+                    <a:stretch>
+                      <a:fillRect/>
+                    </a:stretch>
+                  </pic:blipFill>
+                  <pic:spPr>
+                    <a:xfrm>
+                      <a:off x="0" y="0"/>
+                      <a:ext cx="2323809" cy="2980952"/>
+                    </a:xfrm>
+                    <a:prstGeom prst="rect">
+                      <a:avLst/>
+                    </a:prstGeom>
+                  </pic:spPr>
+                </pic:pic>
+              </a:graphicData>
+            </a:graphic>
+          </wp:inline>
+        </w:drawing>
+      </w:r>
+    </w:p>
+    <w:p>
+      <w:pPr>
+        <w:keepNext/>
+      </w:pPr>
+      <w:r>
+        <w:t>Second step, use the Form to add the calls</w:t>
+      </w:r>
+    </w:p>
+    <w:p>
+      <w:r>
+        <w:rPr>
+          <w:noProof/>
+          <w14:ligatures w14:val="standardContextual"/>
+        </w:rPr>
+        <w:drawing>
+          <wp:inline distT="0" distB="0" distL="0" distR="0" wp14:anchorId="072CB15E" wp14:editId="589D1A98">
+            <wp:extent cx="4714286" cy="2704762"/>
+            <wp:effectExtent l="0" t="0" r="0" b="635"/>
+            <wp:docPr id="938168794" name="Picture 1"/>
+            <wp:cNvGraphicFramePr>
+              <a:graphicFrameLocks xmlns:a="http://schemas.openxmlformats.org/drawingml/2006/main" noChangeAspect="1"/>
+            </wp:cNvGraphicFramePr>
+            <a:graphic xmlns:a="http://schemas.openxmlformats.org/drawingml/2006/main">
+              <a:graphicData uri="http://schemas.openxmlformats.org/drawingml/2006/picture">
+                <pic:pic xmlns:pic="http://schemas.openxmlformats.org/drawingml/2006/picture">
+                  <pic:nvPicPr>
+                    <pic:cNvPr id="938168794" name=""/>
+                    <pic:cNvPicPr/>
+                  </pic:nvPicPr>
+                  <pic:blipFill>
+                    <a:blip r:embed="rId24"/>
+                    <a:stretch>
+                      <a:fillRect/>
+                    </a:stretch>
+                  </pic:blipFill>
+                  <pic:spPr>
+                    <a:xfrm>
+                      <a:off x="0" y="0"/>
+                      <a:ext cx="4714286" cy="2704762"/>
+                    </a:xfrm>
+                    <a:prstGeom prst="rect">
+                      <a:avLst/>
+                    </a:prstGeom>
+                  </pic:spPr>
+                </pic:pic>
+              </a:graphicData>
+            </a:graphic>
+          </wp:inline>
+        </w:drawing>
+      </w:r>
+    </w:p>
+    <w:p>
+      <w:r>
+        <w:t>Last CAGR step, fill in the blanks that the form doesn’t cover</w:t>
+      </w:r>
+    </w:p>
+    <w:p>
+      <w:pPr>
+        <w:keepNext/>
+      </w:pPr>
+      <w:r>
+        <w:rPr>
+          <w:noProof/>
+          <w14:ligatures w14:val="standardContextual"/>
+        </w:rPr>
+        <w:lastRenderedPageBreak/>
+        <w:drawing>
+          <wp:inline distT="0" distB="0" distL="0" distR="0" wp14:anchorId="37B92AB7" wp14:editId="55A89176">
+            <wp:extent cx="5066667" cy="1161905"/>
+            <wp:effectExtent l="0" t="0" r="635" b="635"/>
+            <wp:docPr id="1875598165" name="Picture 1"/>
+            <wp:cNvGraphicFramePr>
+              <a:graphicFrameLocks xmlns:a="http://schemas.openxmlformats.org/drawingml/2006/main" noChangeAspect="1"/>
+            </wp:cNvGraphicFramePr>
+            <a:graphic xmlns:a="http://schemas.openxmlformats.org/drawingml/2006/main">
+              <a:graphicData uri="http://schemas.openxmlformats.org/drawingml/2006/picture">
+                <pic:pic xmlns:pic="http://schemas.openxmlformats.org/drawingml/2006/picture">
+                  <pic:nvPicPr>
+                    <pic:cNvPr id="1875598165" name=""/>
+                    <pic:cNvPicPr/>
+                  </pic:nvPicPr>
+                  <pic:blipFill>
+                    <a:blip r:embed="rId25"/>
+                    <a:stretch>
+                      <a:fillRect/>
+                    </a:stretch>
+                  </pic:blipFill>
+                  <pic:spPr>
+                    <a:xfrm>
+                      <a:off x="0" y="0"/>
+                      <a:ext cx="5066667" cy="1161905"/>
+                    </a:xfrm>
+                    <a:prstGeom prst="rect">
+                      <a:avLst/>
+                    </a:prstGeom>
+                  </pic:spPr>
+                </pic:pic>
+              </a:graphicData>
+            </a:graphic>
+          </wp:inline>
+        </w:drawing>
+      </w:r>
+    </w:p>
+    <w:p>
+      <w:pPr>
+        <w:pStyle w:val="ListParagraph"/>
+        <w:keepNext/>
+        <w:numPr>
+          <w:ilvl w:val="0"/>
+          <w:numId w:val="5"/>
+        </w:numPr>
+      </w:pPr>
+      <w:r>
+        <w:t>Trade Type – this may change as the campaign progresses</w:t>
+      </w:r>
+    </w:p>
+    <w:p>
+      <w:pPr>
+        <w:pStyle w:val="ListParagraph"/>
+        <w:keepNext/>
+        <w:numPr>
+          <w:ilvl w:val="0"/>
+          <w:numId w:val="5"/>
+        </w:numPr>
+      </w:pPr>
+      <w:r>
+        <w:t>Bias (Bullish | Neutral | Bearish)</w:t>
+      </w:r>
+      <w:r>
+        <w:t>– this may change as the campaign progresses</w:t>
+      </w:r>
+    </w:p>
+    <w:p>
+      <w:pPr>
+        <w:pStyle w:val="ListParagraph"/>
+        <w:numPr>
+          <w:ilvl w:val="0"/>
+          <w:numId w:val="5"/>
+        </w:numPr>
+      </w:pPr>
+      <w:r>
+        <w:t>Source – aka, inspiration, if any. News? Someone I follow? Me? (EBF is me)</w:t>
+      </w:r>
+    </w:p>
+    <w:p>
+      <w:pPr>
+        <w:pStyle w:val="ListParagraph"/>
+        <w:numPr>
+          <w:ilvl w:val="0"/>
+          <w:numId w:val="5"/>
+        </w:numPr>
+      </w:pPr>
+      <w:r>
+        <w:t>Entry Trigger – if someone I follow, a trade alerts? An article? ACB reduction?</w:t>
+      </w:r>
+    </w:p>
+    <w:p>
+      <w:pPr>
+        <w:jc w:val="both"/>
+      </w:pPr>
+    </w:p>
+    <w:p>
+      <w:pPr>
+        <w:pStyle w:val="SargeHeader"/>
+      </w:pPr>
+      <w:r>
+        <w:t>First SNAPSHOT entry, MAY BE an unfilled BID</w:t>
+      </w:r>
+    </w:p>
+    <w:p>
+      <w:pPr>
+        <w:pStyle w:val="SargeHeader"/>
+      </w:pPr>
+      <w:r>
+        <w:rPr>
+          <w:noProof/>
+          <w14:ligatures w14:val="standardContextual"/>
+        </w:rPr>
+        <w:drawing>
+          <wp:inline distT="0" distB="0" distL="0" distR="0" wp14:anchorId="5C14910F" wp14:editId="1C0DD3B4">
+            <wp:extent cx="5438095" cy="1152381"/>
+            <wp:effectExtent l="0" t="0" r="0" b="0"/>
+            <wp:docPr id="1900690015" name="Picture 1"/>
+            <wp:cNvGraphicFramePr>
+              <a:graphicFrameLocks xmlns:a="http://schemas.openxmlformats.org/drawingml/2006/main" noChangeAspect="1"/>
+            </wp:cNvGraphicFramePr>
+            <a:graphic xmlns:a="http://schemas.openxmlformats.org/drawingml/2006/main">
+              <a:graphicData uri="http://schemas.openxmlformats.org/drawingml/2006/picture">
+                <pic:pic xmlns:pic="http://schemas.openxmlformats.org/drawingml/2006/picture">
+                  <pic:nvPicPr>
+                    <pic:cNvPr id="1900690015" name=""/>
+                    <pic:cNvPicPr/>
+                  </pic:nvPicPr>
+                  <pic:blipFill>
+                    <a:blip r:embed="rId26"/>
+                    <a:stretch>
+                      <a:fillRect/>
+                    </a:stretch>
+                  </pic:blipFill>
+                  <pic:spPr>
+                    <a:xfrm>
+                      <a:off x="0" y="0"/>
+                      <a:ext cx="5438095" cy="1152381"/>
+                    </a:xfrm>
+                    <a:prstGeom prst="rect">
+                      <a:avLst/>
+                    </a:prstGeom>
+                  </pic:spPr>
+                </pic:pic>
+              </a:graphicData>
+            </a:graphic>
+          </wp:inline>
+        </w:drawing>
+      </w:r>
+    </w:p>
+    <w:p>
+      <w:r>
+        <w:t>SOMETIMES. The transaction DOES begin in the snapshot as a bid, which is just a normal Short Call entry that has no Fill Date. field entry is pretty much the same either way though:</w:t>
+      </w:r>
+    </w:p>
+    <w:p>
+      <w:pPr>
+        <w:pStyle w:val="ListParagraph"/>
+        <w:numPr>
+          <w:ilvl w:val="0"/>
+          <w:numId w:val="6"/>
+        </w:numPr>
+      </w:pPr>
+      <w:r>
+        <w:t>Exp Date (Expiration Date): highlighting means it is due within 7 days</w:t>
+      </w:r>
+    </w:p>
+    <w:p>
+      <w:pPr>
+        <w:pStyle w:val="ListParagraph"/>
+        <w:numPr>
+          <w:ilvl w:val="0"/>
+          <w:numId w:val="6"/>
+        </w:numPr>
+      </w:pPr>
+      <w:r>
+        <w:t>Strike Price</w:t>
+      </w:r>
+    </w:p>
+    <w:p>
+      <w:pPr>
+        <w:pStyle w:val="ListParagraph"/>
+        <w:numPr>
+          <w:ilvl w:val="0"/>
+          <w:numId w:val="6"/>
+        </w:numPr>
+      </w:pPr>
+      <w:r>
+        <w:t>Qty: number of contracts. If number entered exceeds</w:t>
+      </w:r>
+      <w:r>
+        <w:t xml:space="preserve"> long</w:t>
+      </w:r>
+      <w:r>
+        <w:t xml:space="preserve"> </w:t>
+      </w:r>
+      <w:r>
+        <w:t>(</w:t>
+      </w:r>
+      <w:r>
+        <w:t>shares</w:t>
+      </w:r>
+      <w:r>
+        <w:t xml:space="preserve"> + calls) it turns red. 1 column shows max qty is 4</w:t>
+      </w:r>
+    </w:p>
+    <w:p>
+      <w:pPr>
+        <w:pStyle w:val="ListParagraph"/>
+        <w:numPr>
+          <w:ilvl w:val="0"/>
+          <w:numId w:val="6"/>
+        </w:numPr>
+      </w:pPr>
+      <w:r>
+        <w:t>Book date: when first bid</w:t>
+      </w:r>
+    </w:p>
+    <w:p>
+      <w:pPr>
+        <w:pStyle w:val="ListParagraph"/>
+        <w:numPr>
+          <w:ilvl w:val="0"/>
+          <w:numId w:val="6"/>
+        </w:numPr>
+      </w:pPr>
+      <w:r>
+        <w:t>Fill Date</w:t>
+      </w:r>
+    </w:p>
+    <w:p>
+      <w:pPr>
+        <w:pStyle w:val="ListParagraph"/>
+        <w:numPr>
+          <w:ilvl w:val="0"/>
+          <w:numId w:val="6"/>
+        </w:numPr>
+      </w:pPr>
+      <w:r>
+        <w:t>Book Price</w:t>
+      </w:r>
+    </w:p>
+    <w:p>
+      <w:pPr>
+        <w:pStyle w:val="ListParagraph"/>
+        <w:numPr>
+          <w:ilvl w:val="0"/>
+          <w:numId w:val="6"/>
+        </w:numPr>
+      </w:pPr>
+      <w:r>
+        <w:t>Fill Delta</w:t>
+      </w:r>
+    </w:p>
+    <w:p/>
+    <w:p/>
+    <w:p/>
     <w:sectPr>
       <w:pgSz w:w="12240" w:h="15840"/>
       <w:pgMar w:top="720" w:right="720" w:bottom="720" w:left="720" w:header="720" w:footer="720" w:gutter="0"/>
@@ -250,6 +1707,92 @@
     </w:lvl>
   </w:abstractNum>
   <w:abstractNum w:abstractNumId="1" w15:restartNumberingAfterBreak="0">
+    <w:nsid w:val="2834042D"/>
+    <w:multiLevelType w:val="hybridMultilevel"/>
+    <w:tmpl w:val="D0502668"/>
+    <w:lvl w:ilvl="0" w:tplc="0409000F">
+      <w:start w:val="1"/>
+      <w:numFmt w:val="decimal"/>
+      <w:lvlText w:val="%1."/>
+      <w:lvlJc w:val="left"/>
+      <w:pPr>
+        <w:ind w:left="720" w:hanging="360"/>
+      </w:pPr>
+    </w:lvl>
+    <w:lvl w:ilvl="1" w:tplc="04090019">
+      <w:start w:val="1"/>
+      <w:numFmt w:val="lowerLetter"/>
+      <w:lvlText w:val="%2."/>
+      <w:lvlJc w:val="left"/>
+      <w:pPr>
+        <w:ind w:left="1440" w:hanging="360"/>
+      </w:pPr>
+    </w:lvl>
+    <w:lvl w:ilvl="2" w:tplc="0409001B" w:tentative="1">
+      <w:start w:val="1"/>
+      <w:numFmt w:val="lowerRoman"/>
+      <w:lvlText w:val="%3."/>
+      <w:lvlJc w:val="right"/>
+      <w:pPr>
+        <w:ind w:left="2160" w:hanging="180"/>
+      </w:pPr>
+    </w:lvl>
+    <w:lvl w:ilvl="3" w:tplc="0409000F" w:tentative="1">
+      <w:start w:val="1"/>
+      <w:numFmt w:val="decimal"/>
+      <w:lvlText w:val="%4."/>
+      <w:lvlJc w:val="left"/>
+      <w:pPr>
+        <w:ind w:left="2880" w:hanging="360"/>
+      </w:pPr>
+    </w:lvl>
+    <w:lvl w:ilvl="4" w:tplc="04090019" w:tentative="1">
+      <w:start w:val="1"/>
+      <w:numFmt w:val="lowerLetter"/>
+      <w:lvlText w:val="%5."/>
+      <w:lvlJc w:val="left"/>
+      <w:pPr>
+        <w:ind w:left="3600" w:hanging="360"/>
+      </w:pPr>
+    </w:lvl>
+    <w:lvl w:ilvl="5" w:tplc="0409001B" w:tentative="1">
+      <w:start w:val="1"/>
+      <w:numFmt w:val="lowerRoman"/>
+      <w:lvlText w:val="%6."/>
+      <w:lvlJc w:val="right"/>
+      <w:pPr>
+        <w:ind w:left="4320" w:hanging="180"/>
+      </w:pPr>
+    </w:lvl>
+    <w:lvl w:ilvl="6" w:tplc="0409000F" w:tentative="1">
+      <w:start w:val="1"/>
+      <w:numFmt w:val="decimal"/>
+      <w:lvlText w:val="%7."/>
+      <w:lvlJc w:val="left"/>
+      <w:pPr>
+        <w:ind w:left="5040" w:hanging="360"/>
+      </w:pPr>
+    </w:lvl>
+    <w:lvl w:ilvl="7" w:tplc="04090019" w:tentative="1">
+      <w:start w:val="1"/>
+      <w:numFmt w:val="lowerLetter"/>
+      <w:lvlText w:val="%8."/>
+      <w:lvlJc w:val="left"/>
+      <w:pPr>
+        <w:ind w:left="5760" w:hanging="360"/>
+      </w:pPr>
+    </w:lvl>
+    <w:lvl w:ilvl="8" w:tplc="0409001B" w:tentative="1">
+      <w:start w:val="1"/>
+      <w:numFmt w:val="lowerRoman"/>
+      <w:lvlText w:val="%9."/>
+      <w:lvlJc w:val="right"/>
+      <w:pPr>
+        <w:ind w:left="6480" w:hanging="180"/>
+      </w:pPr>
+    </w:lvl>
+  </w:abstractNum>
+  <w:abstractNum w:abstractNumId="2" w15:restartNumberingAfterBreak="0">
     <w:nsid w:val="2DC64C48"/>
     <w:multiLevelType w:val="hybridMultilevel"/>
     <w:tmpl w:val="A0C8814E"/>
@@ -338,11 +1881,335 @@
       </w:pPr>
     </w:lvl>
   </w:abstractNum>
+  <w:abstractNum w:abstractNumId="3" w15:restartNumberingAfterBreak="0">
+    <w:nsid w:val="3A505985"/>
+    <w:multiLevelType w:val="hybridMultilevel"/>
+    <w:tmpl w:val="1BF268FE"/>
+    <w:lvl w:ilvl="0" w:tplc="0409000F">
+      <w:start w:val="1"/>
+      <w:numFmt w:val="decimal"/>
+      <w:lvlText w:val="%1."/>
+      <w:lvlJc w:val="left"/>
+      <w:pPr>
+        <w:ind w:left="720" w:hanging="360"/>
+      </w:pPr>
+    </w:lvl>
+    <w:lvl w:ilvl="1" w:tplc="04090019">
+      <w:start w:val="1"/>
+      <w:numFmt w:val="lowerLetter"/>
+      <w:lvlText w:val="%2."/>
+      <w:lvlJc w:val="left"/>
+      <w:pPr>
+        <w:ind w:left="1440" w:hanging="360"/>
+      </w:pPr>
+    </w:lvl>
+    <w:lvl w:ilvl="2" w:tplc="0409001B" w:tentative="1">
+      <w:start w:val="1"/>
+      <w:numFmt w:val="lowerRoman"/>
+      <w:lvlText w:val="%3."/>
+      <w:lvlJc w:val="right"/>
+      <w:pPr>
+        <w:ind w:left="2160" w:hanging="180"/>
+      </w:pPr>
+    </w:lvl>
+    <w:lvl w:ilvl="3" w:tplc="0409000F" w:tentative="1">
+      <w:start w:val="1"/>
+      <w:numFmt w:val="decimal"/>
+      <w:lvlText w:val="%4."/>
+      <w:lvlJc w:val="left"/>
+      <w:pPr>
+        <w:ind w:left="2880" w:hanging="360"/>
+      </w:pPr>
+    </w:lvl>
+    <w:lvl w:ilvl="4" w:tplc="04090019" w:tentative="1">
+      <w:start w:val="1"/>
+      <w:numFmt w:val="lowerLetter"/>
+      <w:lvlText w:val="%5."/>
+      <w:lvlJc w:val="left"/>
+      <w:pPr>
+        <w:ind w:left="3600" w:hanging="360"/>
+      </w:pPr>
+    </w:lvl>
+    <w:lvl w:ilvl="5" w:tplc="0409001B" w:tentative="1">
+      <w:start w:val="1"/>
+      <w:numFmt w:val="lowerRoman"/>
+      <w:lvlText w:val="%6."/>
+      <w:lvlJc w:val="right"/>
+      <w:pPr>
+        <w:ind w:left="4320" w:hanging="180"/>
+      </w:pPr>
+    </w:lvl>
+    <w:lvl w:ilvl="6" w:tplc="0409000F" w:tentative="1">
+      <w:start w:val="1"/>
+      <w:numFmt w:val="decimal"/>
+      <w:lvlText w:val="%7."/>
+      <w:lvlJc w:val="left"/>
+      <w:pPr>
+        <w:ind w:left="5040" w:hanging="360"/>
+      </w:pPr>
+    </w:lvl>
+    <w:lvl w:ilvl="7" w:tplc="04090019" w:tentative="1">
+      <w:start w:val="1"/>
+      <w:numFmt w:val="lowerLetter"/>
+      <w:lvlText w:val="%8."/>
+      <w:lvlJc w:val="left"/>
+      <w:pPr>
+        <w:ind w:left="5760" w:hanging="360"/>
+      </w:pPr>
+    </w:lvl>
+    <w:lvl w:ilvl="8" w:tplc="0409001B" w:tentative="1">
+      <w:start w:val="1"/>
+      <w:numFmt w:val="lowerRoman"/>
+      <w:lvlText w:val="%9."/>
+      <w:lvlJc w:val="right"/>
+      <w:pPr>
+        <w:ind w:left="6480" w:hanging="180"/>
+      </w:pPr>
+    </w:lvl>
+  </w:abstractNum>
+  <w:abstractNum w:abstractNumId="4" w15:restartNumberingAfterBreak="0">
+    <w:nsid w:val="3FEC0C7E"/>
+    <w:multiLevelType w:val="hybridMultilevel"/>
+    <w:tmpl w:val="D3529D64"/>
+    <w:lvl w:ilvl="0" w:tplc="04090009">
+      <w:start w:val="1"/>
+      <w:numFmt w:val="bullet"/>
+      <w:lvlText w:val=""/>
+      <w:lvlJc w:val="left"/>
+      <w:pPr>
+        <w:ind w:left="720" w:hanging="360"/>
+      </w:pPr>
+      <w:rPr>
+        <w:rFonts w:ascii="Wingdings" w:hAnsi="Wingdings" w:hint="default"/>
+      </w:rPr>
+    </w:lvl>
+    <w:lvl w:ilvl="1" w:tplc="04090003" w:tentative="1">
+      <w:start w:val="1"/>
+      <w:numFmt w:val="bullet"/>
+      <w:lvlText w:val="o"/>
+      <w:lvlJc w:val="left"/>
+      <w:pPr>
+        <w:ind w:left="1440" w:hanging="360"/>
+      </w:pPr>
+      <w:rPr>
+        <w:rFonts w:ascii="Courier New" w:hAnsi="Courier New" w:cs="Courier New" w:hint="default"/>
+      </w:rPr>
+    </w:lvl>
+    <w:lvl w:ilvl="2" w:tplc="04090005" w:tentative="1">
+      <w:start w:val="1"/>
+      <w:numFmt w:val="bullet"/>
+      <w:lvlText w:val=""/>
+      <w:lvlJc w:val="left"/>
+      <w:pPr>
+        <w:ind w:left="2160" w:hanging="360"/>
+      </w:pPr>
+      <w:rPr>
+        <w:rFonts w:ascii="Wingdings" w:hAnsi="Wingdings" w:hint="default"/>
+      </w:rPr>
+    </w:lvl>
+    <w:lvl w:ilvl="3" w:tplc="04090001" w:tentative="1">
+      <w:start w:val="1"/>
+      <w:numFmt w:val="bullet"/>
+      <w:lvlText w:val=""/>
+      <w:lvlJc w:val="left"/>
+      <w:pPr>
+        <w:ind w:left="2880" w:hanging="360"/>
+      </w:pPr>
+      <w:rPr>
+        <w:rFonts w:ascii="Symbol" w:hAnsi="Symbol" w:hint="default"/>
+      </w:rPr>
+    </w:lvl>
+    <w:lvl w:ilvl="4" w:tplc="04090003" w:tentative="1">
+      <w:start w:val="1"/>
+      <w:numFmt w:val="bullet"/>
+      <w:lvlText w:val="o"/>
+      <w:lvlJc w:val="left"/>
+      <w:pPr>
+        <w:ind w:left="3600" w:hanging="360"/>
+      </w:pPr>
+      <w:rPr>
+        <w:rFonts w:ascii="Courier New" w:hAnsi="Courier New" w:cs="Courier New" w:hint="default"/>
+      </w:rPr>
+    </w:lvl>
+    <w:lvl w:ilvl="5" w:tplc="04090005" w:tentative="1">
+      <w:start w:val="1"/>
+      <w:numFmt w:val="bullet"/>
+      <w:lvlText w:val=""/>
+      <w:lvlJc w:val="left"/>
+      <w:pPr>
+        <w:ind w:left="4320" w:hanging="360"/>
+      </w:pPr>
+      <w:rPr>
+        <w:rFonts w:ascii="Wingdings" w:hAnsi="Wingdings" w:hint="default"/>
+      </w:rPr>
+    </w:lvl>
+    <w:lvl w:ilvl="6" w:tplc="04090001" w:tentative="1">
+      <w:start w:val="1"/>
+      <w:numFmt w:val="bullet"/>
+      <w:lvlText w:val=""/>
+      <w:lvlJc w:val="left"/>
+      <w:pPr>
+        <w:ind w:left="5040" w:hanging="360"/>
+      </w:pPr>
+      <w:rPr>
+        <w:rFonts w:ascii="Symbol" w:hAnsi="Symbol" w:hint="default"/>
+      </w:rPr>
+    </w:lvl>
+    <w:lvl w:ilvl="7" w:tplc="04090003" w:tentative="1">
+      <w:start w:val="1"/>
+      <w:numFmt w:val="bullet"/>
+      <w:lvlText w:val="o"/>
+      <w:lvlJc w:val="left"/>
+      <w:pPr>
+        <w:ind w:left="5760" w:hanging="360"/>
+      </w:pPr>
+      <w:rPr>
+        <w:rFonts w:ascii="Courier New" w:hAnsi="Courier New" w:cs="Courier New" w:hint="default"/>
+      </w:rPr>
+    </w:lvl>
+    <w:lvl w:ilvl="8" w:tplc="04090005" w:tentative="1">
+      <w:start w:val="1"/>
+      <w:numFmt w:val="bullet"/>
+      <w:lvlText w:val=""/>
+      <w:lvlJc w:val="left"/>
+      <w:pPr>
+        <w:ind w:left="6480" w:hanging="360"/>
+      </w:pPr>
+      <w:rPr>
+        <w:rFonts w:ascii="Wingdings" w:hAnsi="Wingdings" w:hint="default"/>
+      </w:rPr>
+    </w:lvl>
+  </w:abstractNum>
+  <w:abstractNum w:abstractNumId="5" w15:restartNumberingAfterBreak="0">
+    <w:nsid w:val="6E324836"/>
+    <w:multiLevelType w:val="hybridMultilevel"/>
+    <w:tmpl w:val="F96AFD82"/>
+    <w:lvl w:ilvl="0" w:tplc="04090009">
+      <w:start w:val="1"/>
+      <w:numFmt w:val="bullet"/>
+      <w:lvlText w:val=""/>
+      <w:lvlJc w:val="left"/>
+      <w:pPr>
+        <w:ind w:left="720" w:hanging="360"/>
+      </w:pPr>
+      <w:rPr>
+        <w:rFonts w:ascii="Wingdings" w:hAnsi="Wingdings" w:hint="default"/>
+      </w:rPr>
+    </w:lvl>
+    <w:lvl w:ilvl="1" w:tplc="04090003" w:tentative="1">
+      <w:start w:val="1"/>
+      <w:numFmt w:val="bullet"/>
+      <w:lvlText w:val="o"/>
+      <w:lvlJc w:val="left"/>
+      <w:pPr>
+        <w:ind w:left="1440" w:hanging="360"/>
+      </w:pPr>
+      <w:rPr>
+        <w:rFonts w:ascii="Courier New" w:hAnsi="Courier New" w:cs="Courier New" w:hint="default"/>
+      </w:rPr>
+    </w:lvl>
+    <w:lvl w:ilvl="2" w:tplc="04090005" w:tentative="1">
+      <w:start w:val="1"/>
+      <w:numFmt w:val="bullet"/>
+      <w:lvlText w:val=""/>
+      <w:lvlJc w:val="left"/>
+      <w:pPr>
+        <w:ind w:left="2160" w:hanging="360"/>
+      </w:pPr>
+      <w:rPr>
+        <w:rFonts w:ascii="Wingdings" w:hAnsi="Wingdings" w:hint="default"/>
+      </w:rPr>
+    </w:lvl>
+    <w:lvl w:ilvl="3" w:tplc="04090001" w:tentative="1">
+      <w:start w:val="1"/>
+      <w:numFmt w:val="bullet"/>
+      <w:lvlText w:val=""/>
+      <w:lvlJc w:val="left"/>
+      <w:pPr>
+        <w:ind w:left="2880" w:hanging="360"/>
+      </w:pPr>
+      <w:rPr>
+        <w:rFonts w:ascii="Symbol" w:hAnsi="Symbol" w:hint="default"/>
+      </w:rPr>
+    </w:lvl>
+    <w:lvl w:ilvl="4" w:tplc="04090003" w:tentative="1">
+      <w:start w:val="1"/>
+      <w:numFmt w:val="bullet"/>
+      <w:lvlText w:val="o"/>
+      <w:lvlJc w:val="left"/>
+      <w:pPr>
+        <w:ind w:left="3600" w:hanging="360"/>
+      </w:pPr>
+      <w:rPr>
+        <w:rFonts w:ascii="Courier New" w:hAnsi="Courier New" w:cs="Courier New" w:hint="default"/>
+      </w:rPr>
+    </w:lvl>
+    <w:lvl w:ilvl="5" w:tplc="04090005" w:tentative="1">
+      <w:start w:val="1"/>
+      <w:numFmt w:val="bullet"/>
+      <w:lvlText w:val=""/>
+      <w:lvlJc w:val="left"/>
+      <w:pPr>
+        <w:ind w:left="4320" w:hanging="360"/>
+      </w:pPr>
+      <w:rPr>
+        <w:rFonts w:ascii="Wingdings" w:hAnsi="Wingdings" w:hint="default"/>
+      </w:rPr>
+    </w:lvl>
+    <w:lvl w:ilvl="6" w:tplc="04090001" w:tentative="1">
+      <w:start w:val="1"/>
+      <w:numFmt w:val="bullet"/>
+      <w:lvlText w:val=""/>
+      <w:lvlJc w:val="left"/>
+      <w:pPr>
+        <w:ind w:left="5040" w:hanging="360"/>
+      </w:pPr>
+      <w:rPr>
+        <w:rFonts w:ascii="Symbol" w:hAnsi="Symbol" w:hint="default"/>
+      </w:rPr>
+    </w:lvl>
+    <w:lvl w:ilvl="7" w:tplc="04090003" w:tentative="1">
+      <w:start w:val="1"/>
+      <w:numFmt w:val="bullet"/>
+      <w:lvlText w:val="o"/>
+      <w:lvlJc w:val="left"/>
+      <w:pPr>
+        <w:ind w:left="5760" w:hanging="360"/>
+      </w:pPr>
+      <w:rPr>
+        <w:rFonts w:ascii="Courier New" w:hAnsi="Courier New" w:cs="Courier New" w:hint="default"/>
+      </w:rPr>
+    </w:lvl>
+    <w:lvl w:ilvl="8" w:tplc="04090005" w:tentative="1">
+      <w:start w:val="1"/>
+      <w:numFmt w:val="bullet"/>
+      <w:lvlText w:val=""/>
+      <w:lvlJc w:val="left"/>
+      <w:pPr>
+        <w:ind w:left="6480" w:hanging="360"/>
+      </w:pPr>
+      <w:rPr>
+        <w:rFonts w:ascii="Wingdings" w:hAnsi="Wingdings" w:hint="default"/>
+      </w:rPr>
+    </w:lvl>
+  </w:abstractNum>
   <w:num w:numId="1" w16cid:durableId="1057512699">
-    <w:abstractNumId w:val="1"/>
+    <w:abstractNumId w:val="2"/>
   </w:num>
   <w:num w:numId="2" w16cid:durableId="824319274">
     <w:abstractNumId w:val="0"/>
+  </w:num>
+  <w:num w:numId="3" w16cid:durableId="1659768987">
+    <w:abstractNumId w:val="3"/>
+  </w:num>
+  <w:num w:numId="4" w16cid:durableId="684019778">
+    <w:abstractNumId w:val="1"/>
+  </w:num>
+  <w:num w:numId="5" w16cid:durableId="1905138417">
+    <w:abstractNumId w:val="4"/>
+  </w:num>
+  <w:num w:numId="6" w16cid:durableId="167906704">
+    <w:abstractNumId w:val="5"/>
   </w:num>
 </w:numbering>
 </file>

</xml_diff>